<commit_message>
place order fix due to flatMap, perf fix in placeorder
</commit_message>
<xml_diff>
--- a/docs/DSUITE ENVIRONMENT SETUP.docx
+++ b/docs/DSUITE ENVIRONMENT SETUP.docx
@@ -1,6 +1,6 @@
 
 <file path=word/document.xml><?xml version="1.0" encoding="utf-8"?>
-<w:document xmlns:wpc="http://schemas.microsoft.com/office/word/2010/wordprocessingCanvas" xmlns:cx="http://schemas.microsoft.com/office/drawing/2014/chartex" xmlns:cx1="http://schemas.microsoft.com/office/drawing/2015/9/8/chartex" xmlns:cx2="http://schemas.microsoft.com/office/drawing/2015/10/21/chartex" xmlns:cx3="http://schemas.microsoft.com/office/drawing/2016/5/9/chartex" xmlns:cx4="http://schemas.microsoft.com/office/drawing/2016/5/10/chartex" xmlns:cx5="http://schemas.microsoft.com/office/drawing/2016/5/11/chartex" xmlns:cx6="http://schemas.microsoft.com/office/drawing/2016/5/12/chartex" xmlns:cx7="http://schemas.microsoft.com/office/drawing/2016/5/13/chartex" xmlns:cx8="http://schemas.microsoft.com/office/drawing/2016/5/14/chartex" xmlns:mc="http://schemas.openxmlformats.org/markup-compatibility/2006" xmlns:aink="http://schemas.microsoft.com/office/drawing/2016/ink" xmlns:am3d="http://schemas.microsoft.com/office/drawing/2017/model3d" xmlns:o="urn:schemas-microsoft-com:office:office" xmlns:r="http://schemas.openxmlformats.org/officeDocument/2006/relationships" xmlns:m="http://schemas.openxmlformats.org/officeDocument/2006/math" xmlns:v="urn:schemas-microsoft-com:vml" xmlns:wp14="http://schemas.microsoft.com/office/word/2010/wordprocessingDrawing" xmlns:wp="http://schemas.openxmlformats.org/drawingml/2006/wordprocessingDrawing" xmlns:w10="urn:schemas-microsoft-com:office:word" xmlns:w="http://schemas.openxmlformats.org/wordprocessingml/2006/main" xmlns:w14="http://schemas.microsoft.com/office/word/2010/wordml" xmlns:w15="http://schemas.microsoft.com/office/word/2012/wordml" xmlns:w16cid="http://schemas.microsoft.com/office/word/2016/wordml/cid" xmlns:w16se="http://schemas.microsoft.com/office/word/2015/wordml/symex" xmlns:wpg="http://schemas.microsoft.com/office/word/2010/wordprocessingGroup" xmlns:wpi="http://schemas.microsoft.com/office/word/2010/wordprocessingInk" xmlns:wne="http://schemas.microsoft.com/office/word/2006/wordml" xmlns:wps="http://schemas.microsoft.com/office/word/2010/wordprocessingShape" mc:Ignorable="w14 w15 w16se w16cid wp14">
+<w:document xmlns:wpc="http://schemas.microsoft.com/office/word/2010/wordprocessingCanvas" xmlns:cx="http://schemas.microsoft.com/office/drawing/2014/chartex" xmlns:cx1="http://schemas.microsoft.com/office/drawing/2015/9/8/chartex" xmlns:cx2="http://schemas.microsoft.com/office/drawing/2015/10/21/chartex" xmlns:cx3="http://schemas.microsoft.com/office/drawing/2016/5/9/chartex" xmlns:cx4="http://schemas.microsoft.com/office/drawing/2016/5/10/chartex" xmlns:cx5="http://schemas.microsoft.com/office/drawing/2016/5/11/chartex" xmlns:cx6="http://schemas.microsoft.com/office/drawing/2016/5/12/chartex" xmlns:cx7="http://schemas.microsoft.com/office/drawing/2016/5/13/chartex" xmlns:cx8="http://schemas.microsoft.com/office/drawing/2016/5/14/chartex" xmlns:mc="http://schemas.openxmlformats.org/markup-compatibility/2006" xmlns:aink="http://schemas.microsoft.com/office/drawing/2016/ink" xmlns:am3d="http://schemas.microsoft.com/office/drawing/2017/model3d" xmlns:o="urn:schemas-microsoft-com:office:office" xmlns:oel="http://schemas.microsoft.com/office/2019/extlst" xmlns:r="http://schemas.openxmlformats.org/officeDocument/2006/relationships" xmlns:m="http://schemas.openxmlformats.org/officeDocument/2006/math" xmlns:v="urn:schemas-microsoft-com:vml" xmlns:wp14="http://schemas.microsoft.com/office/word/2010/wordprocessingDrawing" xmlns:wp="http://schemas.openxmlformats.org/drawingml/2006/wordprocessingDrawing" xmlns:w10="urn:schemas-microsoft-com:office:word" xmlns:w="http://schemas.openxmlformats.org/wordprocessingml/2006/main" xmlns:w14="http://schemas.microsoft.com/office/word/2010/wordml" xmlns:w15="http://schemas.microsoft.com/office/word/2012/wordml" xmlns:w16cex="http://schemas.microsoft.com/office/word/2018/wordml/cex" xmlns:w16cid="http://schemas.microsoft.com/office/word/2016/wordml/cid" xmlns:w16="http://schemas.microsoft.com/office/word/2018/wordml" xmlns:w16du="http://schemas.microsoft.com/office/word/2023/wordml/word16du" xmlns:w16sdtdh="http://schemas.microsoft.com/office/word/2020/wordml/sdtdatahash" xmlns:w16se="http://schemas.microsoft.com/office/word/2015/wordml/symex" xmlns:wpg="http://schemas.microsoft.com/office/word/2010/wordprocessingGroup" xmlns:wpi="http://schemas.microsoft.com/office/word/2010/wordprocessingInk" xmlns:wne="http://schemas.microsoft.com/office/word/2006/wordml" xmlns:wps="http://schemas.microsoft.com/office/word/2010/wordprocessingShape" mc:Ignorable="w14 w15 w16se w16cid w16 w16cex w16sdtdh w16du wp14">
   <w:body>
     <w:p>
       <w:pPr>
@@ -43,8 +43,16 @@
         <w:rPr>
           <w:lang w:val="en-US"/>
         </w:rPr>
-        <w:t>Node Js</w:t>
-      </w:r>
+        <w:t xml:space="preserve">Node </w:t>
+      </w:r>
+      <w:proofErr w:type="spellStart"/>
+      <w:r>
+        <w:rPr>
+          <w:lang w:val="en-US"/>
+        </w:rPr>
+        <w:t>Js</w:t>
+      </w:r>
+      <w:proofErr w:type="spellEnd"/>
     </w:p>
     <w:p>
       <w:pPr>
@@ -140,7 +148,21 @@
         <w:rPr>
           <w:lang w:val="en-US"/>
         </w:rPr>
-        <w:t>Clone the code from github. (</w:t>
+        <w:t xml:space="preserve">Clone the code from </w:t>
+      </w:r>
+      <w:proofErr w:type="spellStart"/>
+      <w:r>
+        <w:rPr>
+          <w:lang w:val="en-US"/>
+        </w:rPr>
+        <w:t>github</w:t>
+      </w:r>
+      <w:proofErr w:type="spellEnd"/>
+      <w:r>
+        <w:rPr>
+          <w:lang w:val="en-US"/>
+        </w:rPr>
+        <w:t>. (</w:t>
       </w:r>
       <w:hyperlink r:id="rId5" w:history="1">
         <w:r>
@@ -191,7 +213,21 @@
         <w:rPr>
           <w:lang w:val="en-US"/>
         </w:rPr>
-        <w:t>CD PROJ_LOC/dsuite/</w:t>
+        <w:t>CD PROJ_LOC/</w:t>
+      </w:r>
+      <w:proofErr w:type="spellStart"/>
+      <w:r>
+        <w:rPr>
+          <w:lang w:val="en-US"/>
+        </w:rPr>
+        <w:t>dsuite</w:t>
+      </w:r>
+      <w:proofErr w:type="spellEnd"/>
+      <w:r>
+        <w:rPr>
+          <w:lang w:val="en-US"/>
+        </w:rPr>
+        <w:t>/</w:t>
       </w:r>
       <w:r>
         <w:rPr>
@@ -211,11 +247,19 @@
           <w:lang w:val="en-US"/>
         </w:rPr>
       </w:pPr>
-      <w:r>
-        <w:rPr>
-          <w:lang w:val="en-US"/>
-        </w:rPr>
-        <w:t>npm install</w:t>
+      <w:proofErr w:type="spellStart"/>
+      <w:r>
+        <w:rPr>
+          <w:lang w:val="en-US"/>
+        </w:rPr>
+        <w:t>npm</w:t>
+      </w:r>
+      <w:proofErr w:type="spellEnd"/>
+      <w:r>
+        <w:rPr>
+          <w:lang w:val="en-US"/>
+        </w:rPr>
+        <w:t xml:space="preserve"> install</w:t>
       </w:r>
     </w:p>
     <w:p>
@@ -251,7 +295,21 @@
         <w:rPr>
           <w:lang w:val="en-US"/>
         </w:rPr>
-        <w:t>CD PROJ_LOC/dsuite/client/</w:t>
+        <w:t>CD PROJ_LOC/</w:t>
+      </w:r>
+      <w:proofErr w:type="spellStart"/>
+      <w:r>
+        <w:rPr>
+          <w:lang w:val="en-US"/>
+        </w:rPr>
+        <w:t>dsuite</w:t>
+      </w:r>
+      <w:proofErr w:type="spellEnd"/>
+      <w:r>
+        <w:rPr>
+          <w:lang w:val="en-US"/>
+        </w:rPr>
+        <w:t>/client/</w:t>
       </w:r>
     </w:p>
     <w:p>
@@ -265,11 +323,19 @@
           <w:lang w:val="en-US"/>
         </w:rPr>
       </w:pPr>
-      <w:r>
-        <w:rPr>
-          <w:lang w:val="en-US"/>
-        </w:rPr>
-        <w:t>npm install</w:t>
+      <w:proofErr w:type="spellStart"/>
+      <w:r>
+        <w:rPr>
+          <w:lang w:val="en-US"/>
+        </w:rPr>
+        <w:t>npm</w:t>
+      </w:r>
+      <w:proofErr w:type="spellEnd"/>
+      <w:r>
+        <w:rPr>
+          <w:lang w:val="en-US"/>
+        </w:rPr>
+        <w:t xml:space="preserve"> install</w:t>
       </w:r>
     </w:p>
     <w:p>
@@ -287,7 +353,21 @@
         <w:rPr>
           <w:lang w:val="en-US"/>
         </w:rPr>
-        <w:t>Run the mongo db as service</w:t>
+        <w:t xml:space="preserve">Run the mongo </w:t>
+      </w:r>
+      <w:proofErr w:type="spellStart"/>
+      <w:r>
+        <w:rPr>
+          <w:lang w:val="en-US"/>
+        </w:rPr>
+        <w:t>db</w:t>
+      </w:r>
+      <w:proofErr w:type="spellEnd"/>
+      <w:r>
+        <w:rPr>
+          <w:lang w:val="en-US"/>
+        </w:rPr>
+        <w:t xml:space="preserve"> as service</w:t>
       </w:r>
       <w:r>
         <w:rPr>
@@ -311,7 +391,35 @@
         <w:rPr>
           <w:lang w:val="en-US"/>
         </w:rPr>
-        <w:t>Open Mongodb compass and import the db file. (attached in mail)</w:t>
+        <w:t xml:space="preserve">Open </w:t>
+      </w:r>
+      <w:proofErr w:type="spellStart"/>
+      <w:r>
+        <w:rPr>
+          <w:lang w:val="en-US"/>
+        </w:rPr>
+        <w:t>Mongodb</w:t>
+      </w:r>
+      <w:proofErr w:type="spellEnd"/>
+      <w:r>
+        <w:rPr>
+          <w:lang w:val="en-US"/>
+        </w:rPr>
+        <w:t xml:space="preserve"> compass and import the </w:t>
+      </w:r>
+      <w:proofErr w:type="spellStart"/>
+      <w:r>
+        <w:rPr>
+          <w:lang w:val="en-US"/>
+        </w:rPr>
+        <w:t>db</w:t>
+      </w:r>
+      <w:proofErr w:type="spellEnd"/>
+      <w:r>
+        <w:rPr>
+          <w:lang w:val="en-US"/>
+        </w:rPr>
+        <w:t xml:space="preserve"> file. (attached in mail)</w:t>
       </w:r>
     </w:p>
     <w:p>
@@ -329,8 +437,16 @@
         <w:rPr>
           <w:lang w:val="en-US"/>
         </w:rPr>
-        <w:t>Run the node js</w:t>
-      </w:r>
+        <w:t xml:space="preserve">Run the node </w:t>
+      </w:r>
+      <w:proofErr w:type="spellStart"/>
+      <w:r>
+        <w:rPr>
+          <w:lang w:val="en-US"/>
+        </w:rPr>
+        <w:t>js</w:t>
+      </w:r>
+      <w:proofErr w:type="spellEnd"/>
     </w:p>
     <w:p>
       <w:pPr>
@@ -347,7 +463,21 @@
         <w:rPr>
           <w:lang w:val="en-US"/>
         </w:rPr>
-        <w:t>CD PROJ_LOC/dsuite/</w:t>
+        <w:t>CD PROJ_LOC/</w:t>
+      </w:r>
+      <w:proofErr w:type="spellStart"/>
+      <w:r>
+        <w:rPr>
+          <w:lang w:val="en-US"/>
+        </w:rPr>
+        <w:t>dsuite</w:t>
+      </w:r>
+      <w:proofErr w:type="spellEnd"/>
+      <w:r>
+        <w:rPr>
+          <w:lang w:val="en-US"/>
+        </w:rPr>
+        <w:t>/</w:t>
       </w:r>
       <w:r>
         <w:rPr>
@@ -407,7 +537,21 @@
         <w:rPr>
           <w:lang w:val="en-US"/>
         </w:rPr>
-        <w:t>CD PROJ_LOC/dsuite/client/</w:t>
+        <w:t>CD PROJ_LOC/</w:t>
+      </w:r>
+      <w:proofErr w:type="spellStart"/>
+      <w:r>
+        <w:rPr>
+          <w:lang w:val="en-US"/>
+        </w:rPr>
+        <w:t>dsuite</w:t>
+      </w:r>
+      <w:proofErr w:type="spellEnd"/>
+      <w:r>
+        <w:rPr>
+          <w:lang w:val="en-US"/>
+        </w:rPr>
+        <w:t>/client/</w:t>
       </w:r>
     </w:p>
     <w:p>
@@ -425,8 +569,16 @@
         <w:rPr>
           <w:lang w:val="en-US"/>
         </w:rPr>
-        <w:t>ng serve</w:t>
-      </w:r>
+        <w:t xml:space="preserve">ng </w:t>
+      </w:r>
+      <w:proofErr w:type="gramStart"/>
+      <w:r>
+        <w:rPr>
+          <w:lang w:val="en-US"/>
+        </w:rPr>
+        <w:t>serve</w:t>
+      </w:r>
+      <w:proofErr w:type="gramEnd"/>
     </w:p>
     <w:p>
       <w:pPr>
@@ -533,17 +685,457 @@
         </w:rPr>
         <w:t>’</w:t>
       </w:r>
-      <w:bookmarkStart w:id="0" w:name="_GoBack"/>
-      <w:bookmarkEnd w:id="0"/>
-    </w:p>
-    <w:p>
-      <w:pPr>
-        <w:pStyle w:val="ListParagraph"/>
-        <w:rPr>
-          <w:lang w:val="en-US"/>
-        </w:rPr>
-      </w:pPr>
-    </w:p>
+    </w:p>
+    <w:p>
+      <w:pPr>
+        <w:ind w:left="360"/>
+        <w:rPr>
+          <w:lang w:val="en-US"/>
+        </w:rPr>
+      </w:pPr>
+    </w:p>
+    <w:p>
+      <w:pPr>
+        <w:ind w:left="360"/>
+        <w:rPr>
+          <w:lang w:val="en-US"/>
+        </w:rPr>
+      </w:pPr>
+    </w:p>
+    <w:p>
+      <w:pPr>
+        <w:ind w:left="360"/>
+        <w:rPr>
+          <w:lang w:val="en-US"/>
+        </w:rPr>
+      </w:pPr>
+      <w:r>
+        <w:rPr>
+          <w:lang w:val="en-US"/>
+        </w:rPr>
+        <w:t>BACK UP FROM GZIP FILE</w:t>
+      </w:r>
+    </w:p>
+    <w:p>
+      <w:pPr>
+        <w:pStyle w:val="ListParagraph"/>
+        <w:numPr>
+          <w:ilvl w:val="0"/>
+          <w:numId w:val="5"/>
+        </w:numPr>
+        <w:rPr>
+          <w:lang w:val="en-US"/>
+        </w:rPr>
+      </w:pPr>
+      <w:r>
+        <w:rPr>
+          <w:lang w:val="en-US"/>
+        </w:rPr>
+        <w:t>Run the script to take latest (</w:t>
+      </w:r>
+      <w:r>
+        <w:rPr>
+          <w:lang w:val="en-US"/>
+        </w:rPr>
+        <w:t>bin/bash /opt/backups/db_backup_script.sh</w:t>
+      </w:r>
+      <w:r>
+        <w:rPr>
+          <w:lang w:val="en-US"/>
+        </w:rPr>
+        <w:t>)</w:t>
+      </w:r>
+    </w:p>
+    <w:p>
+      <w:pPr>
+        <w:pStyle w:val="ListParagraph"/>
+        <w:numPr>
+          <w:ilvl w:val="0"/>
+          <w:numId w:val="5"/>
+        </w:numPr>
+        <w:rPr>
+          <w:lang w:val="en-US"/>
+        </w:rPr>
+      </w:pPr>
+      <w:proofErr w:type="spellStart"/>
+      <w:proofErr w:type="gramStart"/>
+      <w:r>
+        <w:rPr>
+          <w:lang w:val="en-US"/>
+        </w:rPr>
+        <w:t>mongorestore</w:t>
+      </w:r>
+      <w:proofErr w:type="spellEnd"/>
+      <w:r>
+        <w:rPr>
+          <w:lang w:val="en-US"/>
+        </w:rPr>
+        <w:t xml:space="preserve">  --</w:t>
+      </w:r>
+      <w:proofErr w:type="spellStart"/>
+      <w:proofErr w:type="gramEnd"/>
+      <w:r>
+        <w:rPr>
+          <w:lang w:val="en-US"/>
+        </w:rPr>
+        <w:t>gzip</w:t>
+      </w:r>
+      <w:proofErr w:type="spellEnd"/>
+      <w:r>
+        <w:rPr>
+          <w:lang w:val="en-US"/>
+        </w:rPr>
+        <w:t xml:space="preserve"> --archive=</w:t>
+      </w:r>
+      <w:proofErr w:type="spellStart"/>
+      <w:r>
+        <w:rPr>
+          <w:lang w:val="en-US"/>
+        </w:rPr>
+        <w:t>mywork</w:t>
+      </w:r>
+      <w:proofErr w:type="spellEnd"/>
+      <w:r>
+        <w:rPr>
+          <w:lang w:val="en-US"/>
+        </w:rPr>
+        <w:t>/</w:t>
+      </w:r>
+      <w:proofErr w:type="spellStart"/>
+      <w:r>
+        <w:rPr>
+          <w:lang w:val="en-US"/>
+        </w:rPr>
+        <w:t>dsuite</w:t>
+      </w:r>
+      <w:proofErr w:type="spellEnd"/>
+      <w:r>
+        <w:rPr>
+          <w:lang w:val="en-US"/>
+        </w:rPr>
+        <w:t>/docs/04-01-25dump.gz</w:t>
+      </w:r>
+    </w:p>
+    <w:p>
+      <w:pPr>
+        <w:rPr>
+          <w:lang w:val="en-US"/>
+        </w:rPr>
+      </w:pPr>
+    </w:p>
+    <w:p>
+      <w:pPr>
+        <w:rPr>
+          <w:b/>
+          <w:bCs/>
+          <w:lang w:val="en-US"/>
+        </w:rPr>
+      </w:pPr>
+      <w:r>
+        <w:rPr>
+          <w:b/>
+          <w:bCs/>
+          <w:lang w:val="en-US"/>
+        </w:rPr>
+        <w:t>Generate OB for each Financial year</w:t>
+      </w:r>
+    </w:p>
+    <w:p>
+      <w:pPr>
+        <w:rPr>
+          <w:lang w:val="en-US"/>
+        </w:rPr>
+      </w:pPr>
+      <w:r>
+        <w:rPr>
+          <w:lang w:val="en-US"/>
+        </w:rPr>
+        <w:t xml:space="preserve">Run the below script by passing </w:t>
+      </w:r>
+      <w:proofErr w:type="spellStart"/>
+      <w:r>
+        <w:rPr>
+          <w:lang w:val="en-US"/>
+        </w:rPr>
+        <w:t>fyear</w:t>
+      </w:r>
+      <w:proofErr w:type="spellEnd"/>
+      <w:r>
+        <w:rPr>
+          <w:lang w:val="en-US"/>
+        </w:rPr>
+        <w:t xml:space="preserve"> as param. (</w:t>
+      </w:r>
+      <w:proofErr w:type="spellStart"/>
+      <w:r>
+        <w:rPr>
+          <w:lang w:val="en-US"/>
+        </w:rPr>
+        <w:t>Fyear</w:t>
+      </w:r>
+      <w:proofErr w:type="spellEnd"/>
+      <w:r>
+        <w:rPr>
+          <w:lang w:val="en-US"/>
+        </w:rPr>
+        <w:t>=</w:t>
+      </w:r>
+      <w:proofErr w:type="spellStart"/>
+      <w:r>
+        <w:rPr>
+          <w:lang w:val="en-US"/>
+        </w:rPr>
+        <w:t>prev</w:t>
+      </w:r>
+      <w:proofErr w:type="spellEnd"/>
+      <w:r>
+        <w:rPr>
+          <w:lang w:val="en-US"/>
+        </w:rPr>
+        <w:t xml:space="preserve"> financial year, which will generate </w:t>
+      </w:r>
+      <w:proofErr w:type="spellStart"/>
+      <w:r>
+        <w:rPr>
+          <w:lang w:val="en-US"/>
+        </w:rPr>
+        <w:t>ob</w:t>
+      </w:r>
+      <w:proofErr w:type="spellEnd"/>
+      <w:r>
+        <w:rPr>
+          <w:lang w:val="en-US"/>
+        </w:rPr>
+        <w:t xml:space="preserve"> for current </w:t>
+      </w:r>
+      <w:proofErr w:type="spellStart"/>
+      <w:r>
+        <w:rPr>
+          <w:lang w:val="en-US"/>
+        </w:rPr>
+        <w:t>fyear</w:t>
+      </w:r>
+      <w:proofErr w:type="spellEnd"/>
+      <w:r>
+        <w:rPr>
+          <w:lang w:val="en-US"/>
+        </w:rPr>
+        <w:t>)</w:t>
+      </w:r>
+    </w:p>
+    <w:p>
+      <w:pPr>
+        <w:pStyle w:val="ListParagraph"/>
+        <w:numPr>
+          <w:ilvl w:val="0"/>
+          <w:numId w:val="6"/>
+        </w:numPr>
+      </w:pPr>
+      <w:r>
+        <w:rPr>
+          <w:lang w:val="en-US"/>
+        </w:rPr>
+        <w:t>/</w:t>
+      </w:r>
+      <w:proofErr w:type="spellStart"/>
+      <w:r>
+        <w:rPr>
+          <w:lang w:val="en-US"/>
+        </w:rPr>
+        <w:t>api</w:t>
+      </w:r>
+      <w:proofErr w:type="spellEnd"/>
+      <w:r>
+        <w:rPr>
+          <w:lang w:val="en-US"/>
+        </w:rPr>
+        <w:t>/scripts/</w:t>
+      </w:r>
+      <w:proofErr w:type="spellStart"/>
+      <w:r>
+        <w:t>generateUserObForEachFYear</w:t>
+      </w:r>
+      <w:r>
+        <w:t>?fyear</w:t>
+      </w:r>
+      <w:proofErr w:type="spellEnd"/>
+      <w:r>
+        <w:t>=2025</w:t>
+      </w:r>
+    </w:p>
+    <w:p>
+      <w:pPr>
+        <w:pStyle w:val="ListParagraph"/>
+        <w:numPr>
+          <w:ilvl w:val="0"/>
+          <w:numId w:val="6"/>
+        </w:numPr>
+      </w:pPr>
+      <w:r>
+        <w:t>Verify the balances in Leads</w:t>
+      </w:r>
+    </w:p>
+    <w:p>
+      <w:r>
+        <w:t>GIT Branch</w:t>
+      </w:r>
+    </w:p>
+    <w:p>
+      <w:pPr>
+        <w:pStyle w:val="ListParagraph"/>
+        <w:numPr>
+          <w:ilvl w:val="0"/>
+          <w:numId w:val="7"/>
+        </w:numPr>
+      </w:pPr>
+      <w:r>
+        <w:t>At present we are using ‘</w:t>
+      </w:r>
+      <w:r>
+        <w:t>counter-sales-and-inventory-temp-repo</w:t>
+      </w:r>
+      <w:r>
+        <w:t>’</w:t>
+      </w:r>
+    </w:p>
+    <w:p>
+      <w:pPr>
+        <w:pStyle w:val="ListParagraph"/>
+        <w:numPr>
+          <w:ilvl w:val="0"/>
+          <w:numId w:val="7"/>
+        </w:numPr>
+      </w:pPr>
+      <w:r>
+        <w:t xml:space="preserve">Recent update (performance improvement in </w:t>
+      </w:r>
+      <w:proofErr w:type="spellStart"/>
+      <w:r>
+        <w:t>Placeorder</w:t>
+      </w:r>
+      <w:proofErr w:type="spellEnd"/>
+      <w:r>
+        <w:t xml:space="preserve">, </w:t>
+      </w:r>
+      <w:proofErr w:type="spellStart"/>
+      <w:r>
+        <w:t>searchOrder</w:t>
+      </w:r>
+      <w:proofErr w:type="spellEnd"/>
+      <w:r>
+        <w:t xml:space="preserve">, </w:t>
+      </w:r>
+      <w:proofErr w:type="spellStart"/>
+      <w:r>
+        <w:t>deliveryList</w:t>
+      </w:r>
+      <w:proofErr w:type="spellEnd"/>
+      <w:r>
+        <w:t>)</w:t>
+      </w:r>
+    </w:p>
+    <w:p/>
+    <w:p>
+      <w:r>
+        <w:lastRenderedPageBreak/>
+        <w:t>Next reasonable updates required:</w:t>
+      </w:r>
+    </w:p>
+    <w:p>
+      <w:pPr>
+        <w:pStyle w:val="ListParagraph"/>
+        <w:numPr>
+          <w:ilvl w:val="0"/>
+          <w:numId w:val="8"/>
+        </w:numPr>
+      </w:pPr>
+      <w:r>
+        <w:t>Dependency updates</w:t>
+      </w:r>
+    </w:p>
+    <w:p>
+      <w:pPr>
+        <w:pStyle w:val="ListParagraph"/>
+        <w:numPr>
+          <w:ilvl w:val="0"/>
+          <w:numId w:val="8"/>
+        </w:numPr>
+      </w:pPr>
+      <w:r>
+        <w:t>Docker</w:t>
+      </w:r>
+    </w:p>
+    <w:p>
+      <w:pPr>
+        <w:pStyle w:val="ListParagraph"/>
+        <w:numPr>
+          <w:ilvl w:val="0"/>
+          <w:numId w:val="8"/>
+        </w:numPr>
+      </w:pPr>
+      <w:r>
+        <w:t xml:space="preserve">CI/CD with </w:t>
+      </w:r>
+      <w:proofErr w:type="spellStart"/>
+      <w:r>
+        <w:t>github</w:t>
+      </w:r>
+      <w:proofErr w:type="spellEnd"/>
+      <w:r>
+        <w:t xml:space="preserve"> actions</w:t>
+      </w:r>
+    </w:p>
+    <w:p>
+      <w:pPr>
+        <w:pStyle w:val="ListParagraph"/>
+        <w:numPr>
+          <w:ilvl w:val="0"/>
+          <w:numId w:val="8"/>
+        </w:numPr>
+      </w:pPr>
+      <w:r>
+        <w:t>Date issues (generic among all area’s)</w:t>
+      </w:r>
+    </w:p>
+    <w:p/>
+    <w:p>
+      <w:r>
+        <w:t>DATE UPDATES:</w:t>
+      </w:r>
+    </w:p>
+    <w:p>
+      <w:pPr>
+        <w:pStyle w:val="ListParagraph"/>
+        <w:numPr>
+          <w:ilvl w:val="0"/>
+          <w:numId w:val="9"/>
+        </w:numPr>
+      </w:pPr>
+      <w:r>
+        <w:t xml:space="preserve">Verified in orders where date is getting stored in ISO format (current </w:t>
+      </w:r>
+      <w:proofErr w:type="spellStart"/>
+      <w:r>
+        <w:t>ist</w:t>
+      </w:r>
+      <w:proofErr w:type="spellEnd"/>
+      <w:r>
+        <w:t xml:space="preserve"> -&gt; iso)</w:t>
+      </w:r>
+    </w:p>
+    <w:p>
+      <w:pPr>
+        <w:pStyle w:val="ListParagraph"/>
+        <w:numPr>
+          <w:ilvl w:val="0"/>
+          <w:numId w:val="9"/>
+        </w:numPr>
+      </w:pPr>
+      <w:r>
+        <w:t>Generating Date in angular produces IST, whereas node produces ISO</w:t>
+      </w:r>
+    </w:p>
+    <w:p/>
     <w:sectPr>
       <w:pgSz w:w="11906" w:h="16838"/>
       <w:pgMar w:top="1440" w:right="1440" w:bottom="1440" w:left="1440" w:header="708" w:footer="708" w:gutter="0"/>
@@ -555,8 +1147,97 @@
 </file>
 
 <file path=word/numbering.xml><?xml version="1.0" encoding="utf-8"?>
-<w:numbering xmlns:wpc="http://schemas.microsoft.com/office/word/2010/wordprocessingCanvas" xmlns:cx="http://schemas.microsoft.com/office/drawing/2014/chartex" xmlns:cx1="http://schemas.microsoft.com/office/drawing/2015/9/8/chartex" xmlns:cx2="http://schemas.microsoft.com/office/drawing/2015/10/21/chartex" xmlns:cx3="http://schemas.microsoft.com/office/drawing/2016/5/9/chartex" xmlns:cx4="http://schemas.microsoft.com/office/drawing/2016/5/10/chartex" xmlns:cx5="http://schemas.microsoft.com/office/drawing/2016/5/11/chartex" xmlns:cx6="http://schemas.microsoft.com/office/drawing/2016/5/12/chartex" xmlns:cx7="http://schemas.microsoft.com/office/drawing/2016/5/13/chartex" xmlns:cx8="http://schemas.microsoft.com/office/drawing/2016/5/14/chartex" xmlns:mc="http://schemas.openxmlformats.org/markup-compatibility/2006" xmlns:aink="http://schemas.microsoft.com/office/drawing/2016/ink" xmlns:am3d="http://schemas.microsoft.com/office/drawing/2017/model3d" xmlns:o="urn:schemas-microsoft-com:office:office" xmlns:r="http://schemas.openxmlformats.org/officeDocument/2006/relationships" xmlns:m="http://schemas.openxmlformats.org/officeDocument/2006/math" xmlns:v="urn:schemas-microsoft-com:vml" xmlns:wp14="http://schemas.microsoft.com/office/word/2010/wordprocessingDrawing" xmlns:wp="http://schemas.openxmlformats.org/drawingml/2006/wordprocessingDrawing" xmlns:w10="urn:schemas-microsoft-com:office:word" xmlns:w="http://schemas.openxmlformats.org/wordprocessingml/2006/main" xmlns:w14="http://schemas.microsoft.com/office/word/2010/wordml" xmlns:w15="http://schemas.microsoft.com/office/word/2012/wordml" xmlns:w16cid="http://schemas.microsoft.com/office/word/2016/wordml/cid" xmlns:w16se="http://schemas.microsoft.com/office/word/2015/wordml/symex" xmlns:wpg="http://schemas.microsoft.com/office/word/2010/wordprocessingGroup" xmlns:wpi="http://schemas.microsoft.com/office/word/2010/wordprocessingInk" xmlns:wne="http://schemas.microsoft.com/office/word/2006/wordml" xmlns:wps="http://schemas.microsoft.com/office/word/2010/wordprocessingShape" mc:Ignorable="w14 w15 w16se w16cid wp14">
+<w:numbering xmlns:wpc="http://schemas.microsoft.com/office/word/2010/wordprocessingCanvas" xmlns:cx="http://schemas.microsoft.com/office/drawing/2014/chartex" xmlns:cx1="http://schemas.microsoft.com/office/drawing/2015/9/8/chartex" xmlns:cx2="http://schemas.microsoft.com/office/drawing/2015/10/21/chartex" xmlns:cx3="http://schemas.microsoft.com/office/drawing/2016/5/9/chartex" xmlns:cx4="http://schemas.microsoft.com/office/drawing/2016/5/10/chartex" xmlns:cx5="http://schemas.microsoft.com/office/drawing/2016/5/11/chartex" xmlns:cx6="http://schemas.microsoft.com/office/drawing/2016/5/12/chartex" xmlns:cx7="http://schemas.microsoft.com/office/drawing/2016/5/13/chartex" xmlns:cx8="http://schemas.microsoft.com/office/drawing/2016/5/14/chartex" xmlns:mc="http://schemas.openxmlformats.org/markup-compatibility/2006" xmlns:aink="http://schemas.microsoft.com/office/drawing/2016/ink" xmlns:am3d="http://schemas.microsoft.com/office/drawing/2017/model3d" xmlns:o="urn:schemas-microsoft-com:office:office" xmlns:oel="http://schemas.microsoft.com/office/2019/extlst" xmlns:r="http://schemas.openxmlformats.org/officeDocument/2006/relationships" xmlns:m="http://schemas.openxmlformats.org/officeDocument/2006/math" xmlns:v="urn:schemas-microsoft-com:vml" xmlns:wp14="http://schemas.microsoft.com/office/word/2010/wordprocessingDrawing" xmlns:wp="http://schemas.openxmlformats.org/drawingml/2006/wordprocessingDrawing" xmlns:w10="urn:schemas-microsoft-com:office:word" xmlns:w="http://schemas.openxmlformats.org/wordprocessingml/2006/main" xmlns:w14="http://schemas.microsoft.com/office/word/2010/wordml" xmlns:w15="http://schemas.microsoft.com/office/word/2012/wordml" xmlns:w16cex="http://schemas.microsoft.com/office/word/2018/wordml/cex" xmlns:w16cid="http://schemas.microsoft.com/office/word/2016/wordml/cid" xmlns:w16="http://schemas.microsoft.com/office/word/2018/wordml" xmlns:w16du="http://schemas.microsoft.com/office/word/2023/wordml/word16du" xmlns:w16sdtdh="http://schemas.microsoft.com/office/word/2020/wordml/sdtdatahash" xmlns:w16se="http://schemas.microsoft.com/office/word/2015/wordml/symex" xmlns:wpg="http://schemas.microsoft.com/office/word/2010/wordprocessingGroup" xmlns:wpi="http://schemas.microsoft.com/office/word/2010/wordprocessingInk" xmlns:wne="http://schemas.microsoft.com/office/word/2006/wordml" xmlns:wps="http://schemas.microsoft.com/office/word/2010/wordprocessingShape" mc:Ignorable="w14 w15 w16se w16cid w16 w16cex w16sdtdh w16du wp14">
   <w:abstractNum w:abstractNumId="0" w15:restartNumberingAfterBreak="0">
+    <w:nsid w:val="0443260E"/>
+    <w:multiLevelType w:val="hybridMultilevel"/>
+    <w:tmpl w:val="32623092"/>
+    <w:lvl w:ilvl="0" w:tplc="0809000F">
+      <w:start w:val="1"/>
+      <w:numFmt w:val="decimal"/>
+      <w:lvlText w:val="%1."/>
+      <w:lvlJc w:val="left"/>
+      <w:pPr>
+        <w:ind w:left="720" w:hanging="360"/>
+      </w:pPr>
+      <w:rPr>
+        <w:rFonts w:hint="default"/>
+      </w:rPr>
+    </w:lvl>
+    <w:lvl w:ilvl="1" w:tplc="08090019" w:tentative="1">
+      <w:start w:val="1"/>
+      <w:numFmt w:val="lowerLetter"/>
+      <w:lvlText w:val="%2."/>
+      <w:lvlJc w:val="left"/>
+      <w:pPr>
+        <w:ind w:left="1440" w:hanging="360"/>
+      </w:pPr>
+    </w:lvl>
+    <w:lvl w:ilvl="2" w:tplc="0809001B" w:tentative="1">
+      <w:start w:val="1"/>
+      <w:numFmt w:val="lowerRoman"/>
+      <w:lvlText w:val="%3."/>
+      <w:lvlJc w:val="right"/>
+      <w:pPr>
+        <w:ind w:left="2160" w:hanging="180"/>
+      </w:pPr>
+    </w:lvl>
+    <w:lvl w:ilvl="3" w:tplc="0809000F" w:tentative="1">
+      <w:start w:val="1"/>
+      <w:numFmt w:val="decimal"/>
+      <w:lvlText w:val="%4."/>
+      <w:lvlJc w:val="left"/>
+      <w:pPr>
+        <w:ind w:left="2880" w:hanging="360"/>
+      </w:pPr>
+    </w:lvl>
+    <w:lvl w:ilvl="4" w:tplc="08090019" w:tentative="1">
+      <w:start w:val="1"/>
+      <w:numFmt w:val="lowerLetter"/>
+      <w:lvlText w:val="%5."/>
+      <w:lvlJc w:val="left"/>
+      <w:pPr>
+        <w:ind w:left="3600" w:hanging="360"/>
+      </w:pPr>
+    </w:lvl>
+    <w:lvl w:ilvl="5" w:tplc="0809001B" w:tentative="1">
+      <w:start w:val="1"/>
+      <w:numFmt w:val="lowerRoman"/>
+      <w:lvlText w:val="%6."/>
+      <w:lvlJc w:val="right"/>
+      <w:pPr>
+        <w:ind w:left="4320" w:hanging="180"/>
+      </w:pPr>
+    </w:lvl>
+    <w:lvl w:ilvl="6" w:tplc="0809000F" w:tentative="1">
+      <w:start w:val="1"/>
+      <w:numFmt w:val="decimal"/>
+      <w:lvlText w:val="%7."/>
+      <w:lvlJc w:val="left"/>
+      <w:pPr>
+        <w:ind w:left="5040" w:hanging="360"/>
+      </w:pPr>
+    </w:lvl>
+    <w:lvl w:ilvl="7" w:tplc="08090019" w:tentative="1">
+      <w:start w:val="1"/>
+      <w:numFmt w:val="lowerLetter"/>
+      <w:lvlText w:val="%8."/>
+      <w:lvlJc w:val="left"/>
+      <w:pPr>
+        <w:ind w:left="5760" w:hanging="360"/>
+      </w:pPr>
+    </w:lvl>
+    <w:lvl w:ilvl="8" w:tplc="0809001B" w:tentative="1">
+      <w:start w:val="1"/>
+      <w:numFmt w:val="lowerRoman"/>
+      <w:lvlText w:val="%9."/>
+      <w:lvlJc w:val="right"/>
+      <w:pPr>
+        <w:ind w:left="6480" w:hanging="180"/>
+      </w:pPr>
+    </w:lvl>
+  </w:abstractNum>
+  <w:abstractNum w:abstractNumId="1" w15:restartNumberingAfterBreak="0">
     <w:nsid w:val="0F4F0818"/>
     <w:multiLevelType w:val="hybridMultilevel"/>
     <w:tmpl w:val="578C1A70"/>
@@ -645,7 +1326,96 @@
       </w:pPr>
     </w:lvl>
   </w:abstractNum>
-  <w:abstractNum w:abstractNumId="1" w15:restartNumberingAfterBreak="0">
+  <w:abstractNum w:abstractNumId="2" w15:restartNumberingAfterBreak="0">
+    <w:nsid w:val="1EDB0062"/>
+    <w:multiLevelType w:val="hybridMultilevel"/>
+    <w:tmpl w:val="2D7C7760"/>
+    <w:lvl w:ilvl="0" w:tplc="0809000F">
+      <w:start w:val="1"/>
+      <w:numFmt w:val="decimal"/>
+      <w:lvlText w:val="%1."/>
+      <w:lvlJc w:val="left"/>
+      <w:pPr>
+        <w:ind w:left="720" w:hanging="360"/>
+      </w:pPr>
+      <w:rPr>
+        <w:rFonts w:hint="default"/>
+      </w:rPr>
+    </w:lvl>
+    <w:lvl w:ilvl="1" w:tplc="08090019" w:tentative="1">
+      <w:start w:val="1"/>
+      <w:numFmt w:val="lowerLetter"/>
+      <w:lvlText w:val="%2."/>
+      <w:lvlJc w:val="left"/>
+      <w:pPr>
+        <w:ind w:left="1440" w:hanging="360"/>
+      </w:pPr>
+    </w:lvl>
+    <w:lvl w:ilvl="2" w:tplc="0809001B" w:tentative="1">
+      <w:start w:val="1"/>
+      <w:numFmt w:val="lowerRoman"/>
+      <w:lvlText w:val="%3."/>
+      <w:lvlJc w:val="right"/>
+      <w:pPr>
+        <w:ind w:left="2160" w:hanging="180"/>
+      </w:pPr>
+    </w:lvl>
+    <w:lvl w:ilvl="3" w:tplc="0809000F" w:tentative="1">
+      <w:start w:val="1"/>
+      <w:numFmt w:val="decimal"/>
+      <w:lvlText w:val="%4."/>
+      <w:lvlJc w:val="left"/>
+      <w:pPr>
+        <w:ind w:left="2880" w:hanging="360"/>
+      </w:pPr>
+    </w:lvl>
+    <w:lvl w:ilvl="4" w:tplc="08090019" w:tentative="1">
+      <w:start w:val="1"/>
+      <w:numFmt w:val="lowerLetter"/>
+      <w:lvlText w:val="%5."/>
+      <w:lvlJc w:val="left"/>
+      <w:pPr>
+        <w:ind w:left="3600" w:hanging="360"/>
+      </w:pPr>
+    </w:lvl>
+    <w:lvl w:ilvl="5" w:tplc="0809001B" w:tentative="1">
+      <w:start w:val="1"/>
+      <w:numFmt w:val="lowerRoman"/>
+      <w:lvlText w:val="%6."/>
+      <w:lvlJc w:val="right"/>
+      <w:pPr>
+        <w:ind w:left="4320" w:hanging="180"/>
+      </w:pPr>
+    </w:lvl>
+    <w:lvl w:ilvl="6" w:tplc="0809000F" w:tentative="1">
+      <w:start w:val="1"/>
+      <w:numFmt w:val="decimal"/>
+      <w:lvlText w:val="%7."/>
+      <w:lvlJc w:val="left"/>
+      <w:pPr>
+        <w:ind w:left="5040" w:hanging="360"/>
+      </w:pPr>
+    </w:lvl>
+    <w:lvl w:ilvl="7" w:tplc="08090019" w:tentative="1">
+      <w:start w:val="1"/>
+      <w:numFmt w:val="lowerLetter"/>
+      <w:lvlText w:val="%8."/>
+      <w:lvlJc w:val="left"/>
+      <w:pPr>
+        <w:ind w:left="5760" w:hanging="360"/>
+      </w:pPr>
+    </w:lvl>
+    <w:lvl w:ilvl="8" w:tplc="0809001B" w:tentative="1">
+      <w:start w:val="1"/>
+      <w:numFmt w:val="lowerRoman"/>
+      <w:lvlText w:val="%9."/>
+      <w:lvlJc w:val="right"/>
+      <w:pPr>
+        <w:ind w:left="6480" w:hanging="180"/>
+      </w:pPr>
+    </w:lvl>
+  </w:abstractNum>
+  <w:abstractNum w:abstractNumId="3" w15:restartNumberingAfterBreak="0">
     <w:nsid w:val="20547E45"/>
     <w:multiLevelType w:val="hybridMultilevel"/>
     <w:tmpl w:val="32820E22"/>
@@ -734,7 +1504,7 @@
       </w:pPr>
     </w:lvl>
   </w:abstractNum>
-  <w:abstractNum w:abstractNumId="2" w15:restartNumberingAfterBreak="0">
+  <w:abstractNum w:abstractNumId="4" w15:restartNumberingAfterBreak="0">
     <w:nsid w:val="2FC377A9"/>
     <w:multiLevelType w:val="hybridMultilevel"/>
     <w:tmpl w:val="FA727E10"/>
@@ -823,7 +1593,274 @@
       </w:pPr>
     </w:lvl>
   </w:abstractNum>
-  <w:abstractNum w:abstractNumId="3" w15:restartNumberingAfterBreak="0">
+  <w:abstractNum w:abstractNumId="5" w15:restartNumberingAfterBreak="0">
+    <w:nsid w:val="568C031E"/>
+    <w:multiLevelType w:val="hybridMultilevel"/>
+    <w:tmpl w:val="2E56DE5A"/>
+    <w:lvl w:ilvl="0" w:tplc="22D83FF0">
+      <w:start w:val="1"/>
+      <w:numFmt w:val="decimal"/>
+      <w:lvlText w:val="%1."/>
+      <w:lvlJc w:val="left"/>
+      <w:pPr>
+        <w:ind w:left="1080" w:hanging="360"/>
+      </w:pPr>
+      <w:rPr>
+        <w:rFonts w:hint="default"/>
+      </w:rPr>
+    </w:lvl>
+    <w:lvl w:ilvl="1" w:tplc="08090019" w:tentative="1">
+      <w:start w:val="1"/>
+      <w:numFmt w:val="lowerLetter"/>
+      <w:lvlText w:val="%2."/>
+      <w:lvlJc w:val="left"/>
+      <w:pPr>
+        <w:ind w:left="1800" w:hanging="360"/>
+      </w:pPr>
+    </w:lvl>
+    <w:lvl w:ilvl="2" w:tplc="0809001B" w:tentative="1">
+      <w:start w:val="1"/>
+      <w:numFmt w:val="lowerRoman"/>
+      <w:lvlText w:val="%3."/>
+      <w:lvlJc w:val="right"/>
+      <w:pPr>
+        <w:ind w:left="2520" w:hanging="180"/>
+      </w:pPr>
+    </w:lvl>
+    <w:lvl w:ilvl="3" w:tplc="0809000F" w:tentative="1">
+      <w:start w:val="1"/>
+      <w:numFmt w:val="decimal"/>
+      <w:lvlText w:val="%4."/>
+      <w:lvlJc w:val="left"/>
+      <w:pPr>
+        <w:ind w:left="3240" w:hanging="360"/>
+      </w:pPr>
+    </w:lvl>
+    <w:lvl w:ilvl="4" w:tplc="08090019" w:tentative="1">
+      <w:start w:val="1"/>
+      <w:numFmt w:val="lowerLetter"/>
+      <w:lvlText w:val="%5."/>
+      <w:lvlJc w:val="left"/>
+      <w:pPr>
+        <w:ind w:left="3960" w:hanging="360"/>
+      </w:pPr>
+    </w:lvl>
+    <w:lvl w:ilvl="5" w:tplc="0809001B" w:tentative="1">
+      <w:start w:val="1"/>
+      <w:numFmt w:val="lowerRoman"/>
+      <w:lvlText w:val="%6."/>
+      <w:lvlJc w:val="right"/>
+      <w:pPr>
+        <w:ind w:left="4680" w:hanging="180"/>
+      </w:pPr>
+    </w:lvl>
+    <w:lvl w:ilvl="6" w:tplc="0809000F" w:tentative="1">
+      <w:start w:val="1"/>
+      <w:numFmt w:val="decimal"/>
+      <w:lvlText w:val="%7."/>
+      <w:lvlJc w:val="left"/>
+      <w:pPr>
+        <w:ind w:left="5400" w:hanging="360"/>
+      </w:pPr>
+    </w:lvl>
+    <w:lvl w:ilvl="7" w:tplc="08090019" w:tentative="1">
+      <w:start w:val="1"/>
+      <w:numFmt w:val="lowerLetter"/>
+      <w:lvlText w:val="%8."/>
+      <w:lvlJc w:val="left"/>
+      <w:pPr>
+        <w:ind w:left="6120" w:hanging="360"/>
+      </w:pPr>
+    </w:lvl>
+    <w:lvl w:ilvl="8" w:tplc="0809001B" w:tentative="1">
+      <w:start w:val="1"/>
+      <w:numFmt w:val="lowerRoman"/>
+      <w:lvlText w:val="%9."/>
+      <w:lvlJc w:val="right"/>
+      <w:pPr>
+        <w:ind w:left="6840" w:hanging="180"/>
+      </w:pPr>
+    </w:lvl>
+  </w:abstractNum>
+  <w:abstractNum w:abstractNumId="6" w15:restartNumberingAfterBreak="0">
+    <w:nsid w:val="61247E04"/>
+    <w:multiLevelType w:val="hybridMultilevel"/>
+    <w:tmpl w:val="6CE63446"/>
+    <w:lvl w:ilvl="0" w:tplc="0809000F">
+      <w:start w:val="1"/>
+      <w:numFmt w:val="decimal"/>
+      <w:lvlText w:val="%1."/>
+      <w:lvlJc w:val="left"/>
+      <w:pPr>
+        <w:ind w:left="720" w:hanging="360"/>
+      </w:pPr>
+      <w:rPr>
+        <w:rFonts w:hint="default"/>
+      </w:rPr>
+    </w:lvl>
+    <w:lvl w:ilvl="1" w:tplc="08090019" w:tentative="1">
+      <w:start w:val="1"/>
+      <w:numFmt w:val="lowerLetter"/>
+      <w:lvlText w:val="%2."/>
+      <w:lvlJc w:val="left"/>
+      <w:pPr>
+        <w:ind w:left="1440" w:hanging="360"/>
+      </w:pPr>
+    </w:lvl>
+    <w:lvl w:ilvl="2" w:tplc="0809001B" w:tentative="1">
+      <w:start w:val="1"/>
+      <w:numFmt w:val="lowerRoman"/>
+      <w:lvlText w:val="%3."/>
+      <w:lvlJc w:val="right"/>
+      <w:pPr>
+        <w:ind w:left="2160" w:hanging="180"/>
+      </w:pPr>
+    </w:lvl>
+    <w:lvl w:ilvl="3" w:tplc="0809000F" w:tentative="1">
+      <w:start w:val="1"/>
+      <w:numFmt w:val="decimal"/>
+      <w:lvlText w:val="%4."/>
+      <w:lvlJc w:val="left"/>
+      <w:pPr>
+        <w:ind w:left="2880" w:hanging="360"/>
+      </w:pPr>
+    </w:lvl>
+    <w:lvl w:ilvl="4" w:tplc="08090019" w:tentative="1">
+      <w:start w:val="1"/>
+      <w:numFmt w:val="lowerLetter"/>
+      <w:lvlText w:val="%5."/>
+      <w:lvlJc w:val="left"/>
+      <w:pPr>
+        <w:ind w:left="3600" w:hanging="360"/>
+      </w:pPr>
+    </w:lvl>
+    <w:lvl w:ilvl="5" w:tplc="0809001B" w:tentative="1">
+      <w:start w:val="1"/>
+      <w:numFmt w:val="lowerRoman"/>
+      <w:lvlText w:val="%6."/>
+      <w:lvlJc w:val="right"/>
+      <w:pPr>
+        <w:ind w:left="4320" w:hanging="180"/>
+      </w:pPr>
+    </w:lvl>
+    <w:lvl w:ilvl="6" w:tplc="0809000F" w:tentative="1">
+      <w:start w:val="1"/>
+      <w:numFmt w:val="decimal"/>
+      <w:lvlText w:val="%7."/>
+      <w:lvlJc w:val="left"/>
+      <w:pPr>
+        <w:ind w:left="5040" w:hanging="360"/>
+      </w:pPr>
+    </w:lvl>
+    <w:lvl w:ilvl="7" w:tplc="08090019" w:tentative="1">
+      <w:start w:val="1"/>
+      <w:numFmt w:val="lowerLetter"/>
+      <w:lvlText w:val="%8."/>
+      <w:lvlJc w:val="left"/>
+      <w:pPr>
+        <w:ind w:left="5760" w:hanging="360"/>
+      </w:pPr>
+    </w:lvl>
+    <w:lvl w:ilvl="8" w:tplc="0809001B" w:tentative="1">
+      <w:start w:val="1"/>
+      <w:numFmt w:val="lowerRoman"/>
+      <w:lvlText w:val="%9."/>
+      <w:lvlJc w:val="right"/>
+      <w:pPr>
+        <w:ind w:left="6480" w:hanging="180"/>
+      </w:pPr>
+    </w:lvl>
+  </w:abstractNum>
+  <w:abstractNum w:abstractNumId="7" w15:restartNumberingAfterBreak="0">
+    <w:nsid w:val="64D206CB"/>
+    <w:multiLevelType w:val="hybridMultilevel"/>
+    <w:tmpl w:val="26B65A52"/>
+    <w:lvl w:ilvl="0" w:tplc="0809000F">
+      <w:start w:val="1"/>
+      <w:numFmt w:val="decimal"/>
+      <w:lvlText w:val="%1."/>
+      <w:lvlJc w:val="left"/>
+      <w:pPr>
+        <w:ind w:left="720" w:hanging="360"/>
+      </w:pPr>
+      <w:rPr>
+        <w:rFonts w:hint="default"/>
+      </w:rPr>
+    </w:lvl>
+    <w:lvl w:ilvl="1" w:tplc="08090019" w:tentative="1">
+      <w:start w:val="1"/>
+      <w:numFmt w:val="lowerLetter"/>
+      <w:lvlText w:val="%2."/>
+      <w:lvlJc w:val="left"/>
+      <w:pPr>
+        <w:ind w:left="1440" w:hanging="360"/>
+      </w:pPr>
+    </w:lvl>
+    <w:lvl w:ilvl="2" w:tplc="0809001B" w:tentative="1">
+      <w:start w:val="1"/>
+      <w:numFmt w:val="lowerRoman"/>
+      <w:lvlText w:val="%3."/>
+      <w:lvlJc w:val="right"/>
+      <w:pPr>
+        <w:ind w:left="2160" w:hanging="180"/>
+      </w:pPr>
+    </w:lvl>
+    <w:lvl w:ilvl="3" w:tplc="0809000F" w:tentative="1">
+      <w:start w:val="1"/>
+      <w:numFmt w:val="decimal"/>
+      <w:lvlText w:val="%4."/>
+      <w:lvlJc w:val="left"/>
+      <w:pPr>
+        <w:ind w:left="2880" w:hanging="360"/>
+      </w:pPr>
+    </w:lvl>
+    <w:lvl w:ilvl="4" w:tplc="08090019" w:tentative="1">
+      <w:start w:val="1"/>
+      <w:numFmt w:val="lowerLetter"/>
+      <w:lvlText w:val="%5."/>
+      <w:lvlJc w:val="left"/>
+      <w:pPr>
+        <w:ind w:left="3600" w:hanging="360"/>
+      </w:pPr>
+    </w:lvl>
+    <w:lvl w:ilvl="5" w:tplc="0809001B" w:tentative="1">
+      <w:start w:val="1"/>
+      <w:numFmt w:val="lowerRoman"/>
+      <w:lvlText w:val="%6."/>
+      <w:lvlJc w:val="right"/>
+      <w:pPr>
+        <w:ind w:left="4320" w:hanging="180"/>
+      </w:pPr>
+    </w:lvl>
+    <w:lvl w:ilvl="6" w:tplc="0809000F" w:tentative="1">
+      <w:start w:val="1"/>
+      <w:numFmt w:val="decimal"/>
+      <w:lvlText w:val="%7."/>
+      <w:lvlJc w:val="left"/>
+      <w:pPr>
+        <w:ind w:left="5040" w:hanging="360"/>
+      </w:pPr>
+    </w:lvl>
+    <w:lvl w:ilvl="7" w:tplc="08090019" w:tentative="1">
+      <w:start w:val="1"/>
+      <w:numFmt w:val="lowerLetter"/>
+      <w:lvlText w:val="%8."/>
+      <w:lvlJc w:val="left"/>
+      <w:pPr>
+        <w:ind w:left="5760" w:hanging="360"/>
+      </w:pPr>
+    </w:lvl>
+    <w:lvl w:ilvl="8" w:tplc="0809001B" w:tentative="1">
+      <w:start w:val="1"/>
+      <w:numFmt w:val="lowerRoman"/>
+      <w:lvlText w:val="%9."/>
+      <w:lvlJc w:val="right"/>
+      <w:pPr>
+        <w:ind w:left="6480" w:hanging="180"/>
+      </w:pPr>
+    </w:lvl>
+  </w:abstractNum>
+  <w:abstractNum w:abstractNumId="8" w15:restartNumberingAfterBreak="0">
     <w:nsid w:val="6D8852CB"/>
     <w:multiLevelType w:val="hybridMultilevel"/>
     <w:tmpl w:val="2CE4B02C"/>
@@ -912,23 +1949,38 @@
       </w:pPr>
     </w:lvl>
   </w:abstractNum>
-  <w:num w:numId="1">
+  <w:num w:numId="1" w16cid:durableId="1185054266">
+    <w:abstractNumId w:val="1"/>
+  </w:num>
+  <w:num w:numId="2" w16cid:durableId="444270494">
+    <w:abstractNumId w:val="8"/>
+  </w:num>
+  <w:num w:numId="3" w16cid:durableId="722295570">
+    <w:abstractNumId w:val="3"/>
+  </w:num>
+  <w:num w:numId="4" w16cid:durableId="1829128387">
+    <w:abstractNumId w:val="4"/>
+  </w:num>
+  <w:num w:numId="5" w16cid:durableId="848954791">
     <w:abstractNumId w:val="0"/>
   </w:num>
-  <w:num w:numId="2">
-    <w:abstractNumId w:val="3"/>
+  <w:num w:numId="6" w16cid:durableId="1413576532">
+    <w:abstractNumId w:val="5"/>
   </w:num>
-  <w:num w:numId="3">
-    <w:abstractNumId w:val="1"/>
+  <w:num w:numId="7" w16cid:durableId="906185269">
+    <w:abstractNumId w:val="7"/>
   </w:num>
-  <w:num w:numId="4">
+  <w:num w:numId="8" w16cid:durableId="98917006">
+    <w:abstractNumId w:val="6"/>
+  </w:num>
+  <w:num w:numId="9" w16cid:durableId="1743285081">
     <w:abstractNumId w:val="2"/>
   </w:num>
 </w:numbering>
 </file>
 
 <file path=word/styles.xml><?xml version="1.0" encoding="utf-8"?>
-<w:styles xmlns:mc="http://schemas.openxmlformats.org/markup-compatibility/2006" xmlns:r="http://schemas.openxmlformats.org/officeDocument/2006/relationships" xmlns:w="http://schemas.openxmlformats.org/wordprocessingml/2006/main" xmlns:w14="http://schemas.microsoft.com/office/word/2010/wordml" xmlns:w15="http://schemas.microsoft.com/office/word/2012/wordml" xmlns:w16cid="http://schemas.microsoft.com/office/word/2016/wordml/cid" xmlns:w16se="http://schemas.microsoft.com/office/word/2015/wordml/symex" mc:Ignorable="w14 w15 w16se w16cid">
+<w:styles xmlns:mc="http://schemas.openxmlformats.org/markup-compatibility/2006" xmlns:r="http://schemas.openxmlformats.org/officeDocument/2006/relationships" xmlns:w="http://schemas.openxmlformats.org/wordprocessingml/2006/main" xmlns:w14="http://schemas.microsoft.com/office/word/2010/wordml" xmlns:w15="http://schemas.microsoft.com/office/word/2012/wordml" xmlns:w16cex="http://schemas.microsoft.com/office/word/2018/wordml/cex" xmlns:w16cid="http://schemas.microsoft.com/office/word/2016/wordml/cid" xmlns:w16="http://schemas.microsoft.com/office/word/2018/wordml" xmlns:w16du="http://schemas.microsoft.com/office/word/2023/wordml/word16du" xmlns:w16sdtdh="http://schemas.microsoft.com/office/word/2020/wordml/sdtdatahash" xmlns:w16se="http://schemas.microsoft.com/office/word/2015/wordml/symex" mc:Ignorable="w14 w15 w16se w16cid w16 w16cex w16sdtdh w16du">
   <w:docDefaults>
     <w:rPrDefault>
       <w:rPr>
@@ -944,7 +1996,7 @@
       </w:pPr>
     </w:pPrDefault>
   </w:docDefaults>
-  <w:latentStyles w:defLockedState="0" w:defUIPriority="99" w:defSemiHidden="0" w:defUnhideWhenUsed="0" w:defQFormat="0" w:count="377">
+  <w:latentStyles w:defLockedState="0" w:defUIPriority="99" w:defSemiHidden="0" w:defUnhideWhenUsed="0" w:defQFormat="0" w:count="376">
     <w:lsdException w:name="Normal" w:uiPriority="0" w:qFormat="1"/>
     <w:lsdException w:name="heading 1" w:uiPriority="9" w:qFormat="1"/>
     <w:lsdException w:name="heading 2" w:semiHidden="1" w:uiPriority="9" w:unhideWhenUsed="1" w:qFormat="1"/>
@@ -1321,7 +2373,6 @@
     <w:lsdException w:name="Hashtag" w:semiHidden="1" w:unhideWhenUsed="1"/>
     <w:lsdException w:name="Unresolved Mention" w:semiHidden="1" w:unhideWhenUsed="1"/>
     <w:lsdException w:name="Smart Link" w:semiHidden="1" w:unhideWhenUsed="1"/>
-    <w:lsdException w:name="Smart Link Error" w:semiHidden="1" w:unhideWhenUsed="1"/>
   </w:latentStyles>
   <w:style w:type="paragraph" w:default="1" w:styleId="Normal">
     <w:name w:val="Normal"/>
@@ -1330,7 +2381,6 @@
   <w:style w:type="character" w:default="1" w:styleId="DefaultParagraphFont">
     <w:name w:val="Default Paragraph Font"/>
     <w:uiPriority w:val="1"/>
-    <w:semiHidden/>
     <w:unhideWhenUsed/>
   </w:style>
   <w:style w:type="table" w:default="1" w:styleId="TableNormal">

</xml_diff>